<commit_message>
feat: support Mẫu 01 survey form
Extend the application to support both Mẫu 01 and Mẫu 02 survey forms in accordance with Ministry of Public Security regulations, including UI tab switching and backend template handling.
</commit_message>
<xml_diff>
--- a/template/Mẫu 01.docx
+++ b/template/Mẫu 01.docx
@@ -16,191 +16,8 @@
         <w:rPr>
           <w:rFonts w:ascii="Times New Roman" w:hAnsi="Times New Roman" w:cs="Times New Roman"/>
           <w:b/>
-          <w:noProof/>
-          <w:color w:val="auto"/>
-          <w:lang w:val="en-US" w:eastAsia="en-US"/>
-          <w14:ligatures w14:val="standardContextual"/>
-        </w:rPr>
-        <mc:AlternateContent>
-          <mc:Choice Requires="wps">
-            <w:drawing>
-              <wp:anchor distT="0" distB="0" distL="114300" distR="114300" simplePos="0" relativeHeight="251659264" behindDoc="1" locked="0" layoutInCell="1" allowOverlap="1" wp14:anchorId="59908CC6" wp14:editId="5E064D70">
-                <wp:simplePos x="0" y="0"/>
-                <wp:positionH relativeFrom="margin">
-                  <wp:align>right</wp:align>
-                </wp:positionH>
-                <wp:positionV relativeFrom="paragraph">
-                  <wp:posOffset>0</wp:posOffset>
-                </wp:positionV>
-                <wp:extent cx="792000" cy="396000"/>
-                <wp:effectExtent l="0" t="0" r="27305" b="23495"/>
-                <wp:wrapNone/>
-                <wp:docPr id="198695449" name="Rectangle 1"/>
-                <wp:cNvGraphicFramePr/>
-                <a:graphic xmlns:a="http://schemas.openxmlformats.org/drawingml/2006/main">
-                  <a:graphicData uri="http://schemas.microsoft.com/office/word/2010/wordprocessingShape">
-                    <wps:wsp>
-                      <wps:cNvSpPr/>
-                      <wps:spPr>
-                        <a:xfrm>
-                          <a:off x="0" y="0"/>
-                          <a:ext cx="792000" cy="396000"/>
-                        </a:xfrm>
-                        <a:prstGeom prst="rect">
-                          <a:avLst/>
-                        </a:prstGeom>
-                        <a:ln>
-                          <a:solidFill>
-                            <a:schemeClr val="tx1"/>
-                          </a:solidFill>
-                        </a:ln>
-                      </wps:spPr>
-                      <wps:style>
-                        <a:lnRef idx="2">
-                          <a:schemeClr val="accent6"/>
-                        </a:lnRef>
-                        <a:fillRef idx="1">
-                          <a:schemeClr val="lt1"/>
-                        </a:fillRef>
-                        <a:effectRef idx="0">
-                          <a:schemeClr val="accent6"/>
-                        </a:effectRef>
-                        <a:fontRef idx="minor">
-                          <a:schemeClr val="dk1"/>
-                        </a:fontRef>
-                      </wps:style>
-                      <wps:txbx>
-                        <w:txbxContent>
-                          <w:p>
-                            <w:pPr>
-                              <w:spacing w:before="120"/>
-                              <w:jc w:val="center"/>
-                              <w:rPr>
-                                <w:rFonts w:ascii="Times New Roman" w:hAnsi="Times New Roman" w:cs="Times New Roman"/>
-                                <w:b/>
-                                <w:color w:val="auto"/>
-                                <w:lang w:val="en-US"/>
-                              </w:rPr>
-                            </w:pPr>
-                            <w:r>
-                              <w:rPr>
-                                <w:rFonts w:ascii="Times New Roman" w:hAnsi="Times New Roman" w:cs="Times New Roman"/>
-                                <w:b/>
-                                <w:color w:val="auto"/>
-                                <w:lang w:val="en-US"/>
-                              </w:rPr>
-                              <w:t>MẪU 0</w:t>
-                            </w:r>
-                            <w:r>
-                              <w:rPr>
-                                <w:rFonts w:ascii="Times New Roman" w:hAnsi="Times New Roman" w:cs="Times New Roman"/>
-                                <w:b/>
-                                <w:color w:val="auto"/>
-                                <w:lang w:val="en-US"/>
-                              </w:rPr>
-                              <w:t>1</w:t>
-                            </w:r>
-                          </w:p>
-                        </w:txbxContent>
-                      </wps:txbx>
-                      <wps:bodyPr rot="0" spcFirstLastPara="0" vertOverflow="overflow" horzOverflow="overflow" vert="horz" wrap="square" lIns="91440" tIns="45720" rIns="91440" bIns="45720" numCol="1" spcCol="0" rtlCol="0" fromWordArt="0" anchor="ctr" anchorCtr="0" forceAA="0" compatLnSpc="1">
-                        <a:prstTxWarp prst="textNoShape">
-                          <a:avLst/>
-                        </a:prstTxWarp>
-                        <a:noAutofit/>
-                      </wps:bodyPr>
-                    </wps:wsp>
-                  </a:graphicData>
-                </a:graphic>
-                <wp14:sizeRelH relativeFrom="margin">
-                  <wp14:pctWidth>0</wp14:pctWidth>
-                </wp14:sizeRelH>
-                <wp14:sizeRelV relativeFrom="margin">
-                  <wp14:pctHeight>0</wp14:pctHeight>
-                </wp14:sizeRelV>
-              </wp:anchor>
-            </w:drawing>
-          </mc:Choice>
-          <mc:Fallback xmlns:oel="http://schemas.microsoft.com/office/2019/extlst" xmlns:w16du="http://schemas.microsoft.com/office/word/2023/wordml/word16du">
-            <w:pict>
-              <v:rect w14:anchorId="59908CC6" id="Rectangle 1" o:spid="_x0000_s1026" style="position:absolute;left:0;text-align:left;margin-left:11.15pt;margin-top:0;width:62.35pt;height:31.2pt;z-index:-251657216;visibility:visible;mso-wrap-style:square;mso-width-percent:0;mso-height-percent:0;mso-wrap-distance-left:9pt;mso-wrap-distance-top:0;mso-wrap-distance-right:9pt;mso-wrap-distance-bottom:0;mso-position-horizontal:right;mso-position-horizontal-relative:margin;mso-position-vertical:absolute;mso-position-vertical-relative:text;mso-width-percent:0;mso-height-percent:0;mso-width-relative:margin;mso-height-relative:margin;v-text-anchor:middle" o:gfxdata="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" fillcolor="white [3201]" strokecolor="black [3213]" strokeweight="1pt">
-                <v:textbox>
-                  <w:txbxContent>
-                    <w:p>
-                      <w:pPr>
-                        <w:spacing w:before="120"/>
-                        <w:jc w:val="center"/>
-                        <w:rPr>
-                          <w:rFonts w:ascii="Times New Roman" w:hAnsi="Times New Roman" w:cs="Times New Roman"/>
-                          <w:b/>
-                          <w:color w:val="auto"/>
-                          <w:lang w:val="en-US"/>
-                        </w:rPr>
-                      </w:pPr>
-                      <w:r>
-                        <w:rPr>
-                          <w:rFonts w:ascii="Times New Roman" w:hAnsi="Times New Roman" w:cs="Times New Roman"/>
-                          <w:b/>
-                          <w:color w:val="auto"/>
-                          <w:lang w:val="en-US"/>
-                        </w:rPr>
-                        <w:t>MẪU 0</w:t>
-                      </w:r>
-                      <w:r>
-                        <w:rPr>
-                          <w:rFonts w:ascii="Times New Roman" w:hAnsi="Times New Roman" w:cs="Times New Roman"/>
-                          <w:b/>
-                          <w:color w:val="auto"/>
-                          <w:lang w:val="en-US"/>
-                        </w:rPr>
-                        <w:t>1</w:t>
-                      </w:r>
-                    </w:p>
-                  </w:txbxContent>
-                </v:textbox>
-                <w10:wrap anchorx="margin"/>
-              </v:rect>
-            </w:pict>
-          </mc:Fallback>
-        </mc:AlternateContent>
-      </w:r>
-      <w:r>
-        <w:rPr>
-          <w:rFonts w:ascii="Times New Roman" w:hAnsi="Times New Roman" w:cs="Times New Roman"/>
-          <w:b/>
-          <w:color w:val="auto"/>
-        </w:rPr>
-        <w:t>CỘNG HÒA XÃ HỘI CHỦ NGHĨA VIỆT NAM</w:t>
-      </w:r>
-      <w:r>
-        <w:rPr>
-          <w:rFonts w:ascii="Times New Roman" w:hAnsi="Times New Roman" w:cs="Times New Roman"/>
-          <w:b/>
-          <w:color w:val="auto"/>
-        </w:rPr>
-        <w:br/>
-        <w:t>Độc lập - Tự do - Hạnh phúc</w:t>
-      </w:r>
-      <w:r>
-        <w:rPr>
-          <w:rFonts w:ascii="Times New Roman" w:hAnsi="Times New Roman" w:cs="Times New Roman"/>
-          <w:b/>
-          <w:color w:val="auto"/>
-          <w:sz w:val="20"/>
-          <w:szCs w:val="20"/>
-        </w:rPr>
-        <w:t xml:space="preserve"> </w:t>
-      </w:r>
-      <w:r>
-        <w:rPr>
-          <w:rFonts w:ascii="Times New Roman" w:hAnsi="Times New Roman" w:cs="Times New Roman"/>
-          <w:b/>
-          <w:color w:val="auto"/>
-          <w:sz w:val="20"/>
-          <w:szCs w:val="20"/>
-        </w:rPr>
-        <w:br/>
-        <w:t>---------------</w:t>
+        </w:rPr>
+        <w:t xml:space="preserve">MẪU 01</w:t>
       </w:r>
     </w:p>
     <w:p>
@@ -238,81 +55,19 @@
           <w:color w:val="auto"/>
           <w:sz w:val="28"/>
           <w:szCs w:val="28"/>
-          <w:lang w:val="en-US"/>
         </w:rPr>
       </w:pPr>
-      <w:bookmarkStart w:id="0" w:name="_Hlk172534261"/>
       <w:r>
         <w:rPr>
           <w:rFonts w:ascii="Times New Roman" w:hAnsi="Times New Roman" w:cs="Times New Roman"/>
           <w:b/>
-          <w:color w:val="auto"/>
-          <w:sz w:val="28"/>
-          <w:szCs w:val="28"/>
-          <w:lang w:val="en-US"/>
-        </w:rPr>
-        <w:t xml:space="preserve">Thông tin liệt sĩ </w:t>
-      </w:r>
-      <w:r>
-        <w:rPr>
-          <w:rFonts w:ascii="Times New Roman" w:hAnsi="Times New Roman" w:cs="Times New Roman"/>
-          <w:b/>
-          <w:color w:val="auto"/>
-          <w:sz w:val="28"/>
-          <w:szCs w:val="28"/>
-          <w:lang w:val="en-US"/>
-        </w:rPr>
-        <w:t>đã</w:t>
-      </w:r>
-      <w:r>
-        <w:rPr>
-          <w:rFonts w:ascii="Times New Roman" w:hAnsi="Times New Roman" w:cs="Times New Roman"/>
-          <w:b/>
-          <w:color w:val="auto"/>
-          <w:sz w:val="28"/>
-          <w:szCs w:val="28"/>
-          <w:lang w:val="en-US"/>
-        </w:rPr>
-        <w:t xml:space="preserve"> xác định </w:t>
-      </w:r>
-      <w:r>
-        <w:rPr>
-          <w:rFonts w:ascii="Times New Roman" w:hAnsi="Times New Roman" w:cs="Times New Roman"/>
-          <w:b/>
-          <w:color w:val="auto"/>
-          <w:sz w:val="28"/>
-          <w:szCs w:val="28"/>
-          <w:lang w:val="en-US"/>
-        </w:rPr>
-        <w:t>thông tin phần mộ</w:t>
-      </w:r>
-      <w:r>
-        <w:rPr>
-          <w:rFonts w:ascii="Times New Roman" w:hAnsi="Times New Roman" w:cs="Times New Roman"/>
-          <w:b/>
-          <w:color w:val="auto"/>
-          <w:sz w:val="28"/>
-          <w:szCs w:val="28"/>
-          <w:lang w:val="en-US"/>
-        </w:rPr>
-        <w:t xml:space="preserve"> </w:t>
-      </w:r>
-      <w:bookmarkEnd w:id="0"/>
-      <w:r>
-        <w:rPr>
-          <w:rFonts w:ascii="Times New Roman" w:hAnsi="Times New Roman" w:cs="Times New Roman"/>
-          <w:b/>
-          <w:color w:val="auto"/>
-          <w:sz w:val="28"/>
-          <w:szCs w:val="28"/>
-          <w:lang w:val="en-US"/>
-        </w:rPr>
-        <w:t>và người hưởng trợ cấp của liệt sĩ</w:t>
+        </w:rPr>
+        <w:t xml:space="preserve">Thông tin liệt sĩ đã xác định thông tin phần mộ và người hưởng trợ cấp của liệt sĩ</w:t>
       </w:r>
     </w:p>
     <w:p>
       <w:pPr>
-        <w:spacing w:before="40" w:after="40" w:line="252" w:lineRule="auto"/>
+        <w:spacing w:before="40" w:after="40" w:line="276" w:lineRule="auto"/>
         <w:contextualSpacing/>
         <w:rPr>
           <w:rFonts w:ascii="Times New Roman" w:hAnsi="Times New Roman" w:cs="Times New Roman"/>
@@ -381,7 +136,7 @@
         <w:tabs>
           <w:tab w:val="left" w:leader="dot" w:pos="9072"/>
         </w:tabs>
-        <w:spacing w:before="40" w:after="40" w:line="252" w:lineRule="auto"/>
+        <w:spacing w:before="40" w:after="40" w:line="276" w:lineRule="auto"/>
         <w:contextualSpacing/>
         <w:rPr>
           <w:rFonts w:ascii="Times New Roman" w:hAnsi="Times New Roman" w:cs="Times New Roman"/>
@@ -419,7 +174,7 @@
           <w:tab w:val="left" w:leader="dot" w:pos="5670"/>
           <w:tab w:val="left" w:leader="dot" w:pos="9072"/>
         </w:tabs>
-        <w:spacing w:before="40" w:after="40" w:line="252" w:lineRule="auto"/>
+        <w:spacing w:before="40" w:after="40" w:line="276" w:lineRule="auto"/>
         <w:contextualSpacing/>
         <w:rPr>
           <w:rFonts w:ascii="Times New Roman" w:hAnsi="Times New Roman" w:cs="Times New Roman"/>
@@ -481,7 +236,7 @@
           <w:tab w:val="left" w:leader="dot" w:pos="5670"/>
           <w:tab w:val="left" w:leader="dot" w:pos="9072"/>
         </w:tabs>
-        <w:spacing w:before="40" w:after="40" w:line="252" w:lineRule="auto"/>
+        <w:spacing w:before="40" w:after="40" w:line="276" w:lineRule="auto"/>
         <w:contextualSpacing/>
         <w:rPr>
           <w:rFonts w:ascii="Times New Roman" w:hAnsi="Times New Roman" w:cs="Times New Roman"/>
@@ -556,7 +311,7 @@
         <w:tabs>
           <w:tab w:val="left" w:leader="dot" w:pos="9072"/>
         </w:tabs>
-        <w:spacing w:before="40" w:after="40" w:line="252" w:lineRule="auto"/>
+        <w:spacing w:before="40" w:after="40" w:line="276" w:lineRule="auto"/>
         <w:contextualSpacing/>
         <w:rPr>
           <w:rFonts w:ascii="Times New Roman" w:hAnsi="Times New Roman" w:cs="Times New Roman"/>
@@ -585,7 +340,7 @@
         <w:tabs>
           <w:tab w:val="left" w:leader="dot" w:pos="9072"/>
         </w:tabs>
-        <w:spacing w:before="40" w:after="40" w:line="252" w:lineRule="auto"/>
+        <w:spacing w:before="40" w:after="40" w:line="276" w:lineRule="auto"/>
         <w:contextualSpacing/>
         <w:rPr>
           <w:rFonts w:ascii="Times New Roman" w:hAnsi="Times New Roman" w:cs="Times New Roman"/>
@@ -607,60 +362,6 @@
           <w:lang w:val="en-US"/>
         </w:rPr>
         <w:tab/>
-      </w:r>
-    </w:p>
-    <w:p>
-      <w:pPr>
-        <w:spacing w:before="40" w:after="40" w:line="252" w:lineRule="auto"/>
-        <w:contextualSpacing/>
-        <w:rPr>
-          <w:rFonts w:ascii="Times New Roman" w:hAnsi="Times New Roman" w:cs="Times New Roman"/>
-          <w:color w:val="auto"/>
-          <w:lang w:val="en-US"/>
-        </w:rPr>
-      </w:pPr>
-      <w:r>
-        <w:rPr>
-          <w:rFonts w:ascii="Times New Roman" w:hAnsi="Times New Roman" w:cs="Times New Roman"/>
-          <w:color w:val="auto"/>
-        </w:rPr>
-        <w:t xml:space="preserve">Số điện thoại: </w:t>
-      </w:r>
-      <w:r>
-        <w:rPr>
-          <w:rFonts w:ascii="Times New Roman" w:hAnsi="Times New Roman" w:cs="Times New Roman"/>
-          <w:color w:val="auto"/>
-          <w:lang w:val="en-US"/>
-        </w:rPr>
-        <w:tab/>
-      </w:r>
-    </w:p>
-    <w:p>
-      <w:pPr>
-        <w:spacing w:before="40" w:after="40" w:line="252" w:lineRule="auto"/>
-        <w:contextualSpacing/>
-        <w:rPr>
-          <w:rFonts w:ascii="Times New Roman" w:hAnsi="Times New Roman" w:cs="Times New Roman"/>
-          <w:b/>
-          <w:color w:val="auto"/>
-        </w:rPr>
-      </w:pPr>
-      <w:r>
-        <w:rPr>
-          <w:rFonts w:ascii="Times New Roman" w:hAnsi="Times New Roman" w:cs="Times New Roman"/>
-          <w:b/>
-          <w:color w:val="auto"/>
-          <w:lang w:val="en-US"/>
-        </w:rPr>
-        <w:t>2</w:t>
-      </w:r>
-      <w:r>
-        <w:rPr>
-          <w:rFonts w:ascii="Times New Roman" w:hAnsi="Times New Roman" w:cs="Times New Roman"/>
-          <w:b/>
-          <w:color w:val="auto"/>
-        </w:rPr>
-        <w:t>. Thông tin về liệt sĩ:</w:t>
       </w:r>
     </w:p>
     <w:p>
@@ -668,7 +369,64 @@
         <w:tabs>
           <w:tab w:val="left" w:leader="dot" w:pos="9072"/>
         </w:tabs>
-        <w:spacing w:before="40" w:after="40" w:line="252" w:lineRule="auto"/>
+        <w:spacing w:before="40" w:after="40" w:line="276" w:lineRule="auto"/>
+        <w:contextualSpacing/>
+        <w:rPr>
+          <w:rFonts w:ascii="Times New Roman" w:hAnsi="Times New Roman" w:cs="Times New Roman"/>
+          <w:color w:val="auto"/>
+          <w:lang w:val="en-US"/>
+        </w:rPr>
+      </w:pPr>
+      <w:r>
+        <w:rPr>
+          <w:rFonts w:ascii="Times New Roman" w:hAnsi="Times New Roman" w:cs="Times New Roman"/>
+          <w:color w:val="auto"/>
+        </w:rPr>
+        <w:t xml:space="preserve">Số điện thoại: </w:t>
+      </w:r>
+      <w:r>
+        <w:rPr>
+          <w:rFonts w:ascii="Times New Roman" w:hAnsi="Times New Roman" w:cs="Times New Roman"/>
+          <w:color w:val="auto"/>
+          <w:lang w:val="en-US"/>
+        </w:rPr>
+        <w:tab/>
+      </w:r>
+    </w:p>
+    <w:p>
+      <w:pPr>
+        <w:spacing w:before="40" w:after="40" w:line="276" w:lineRule="auto"/>
+        <w:contextualSpacing/>
+        <w:rPr>
+          <w:rFonts w:ascii="Times New Roman" w:hAnsi="Times New Roman" w:cs="Times New Roman"/>
+          <w:b/>
+          <w:color w:val="auto"/>
+        </w:rPr>
+      </w:pPr>
+      <w:r>
+        <w:rPr>
+          <w:rFonts w:ascii="Times New Roman" w:hAnsi="Times New Roman" w:cs="Times New Roman"/>
+          <w:b/>
+          <w:color w:val="auto"/>
+          <w:lang w:val="en-US"/>
+        </w:rPr>
+        <w:t>2</w:t>
+      </w:r>
+      <w:r>
+        <w:rPr>
+          <w:rFonts w:ascii="Times New Roman" w:hAnsi="Times New Roman" w:cs="Times New Roman"/>
+          <w:b/>
+          <w:color w:val="auto"/>
+        </w:rPr>
+        <w:t>. Thông tin về liệt sĩ:</w:t>
+      </w:r>
+    </w:p>
+    <w:p>
+      <w:pPr>
+        <w:tabs>
+          <w:tab w:val="left" w:leader="dot" w:pos="9072"/>
+        </w:tabs>
+        <w:spacing w:before="40" w:after="40" w:line="276" w:lineRule="auto"/>
         <w:contextualSpacing/>
         <w:rPr>
           <w:rFonts w:ascii="Times New Roman" w:hAnsi="Times New Roman" w:cs="Times New Roman"/>
@@ -714,7 +472,7 @@
         <w:tabs>
           <w:tab w:val="left" w:leader="dot" w:pos="4253"/>
         </w:tabs>
-        <w:spacing w:before="40" w:after="40" w:line="252" w:lineRule="auto"/>
+        <w:spacing w:before="40" w:after="40" w:line="276" w:lineRule="auto"/>
         <w:contextualSpacing/>
         <w:rPr>
           <w:rFonts w:ascii="Times New Roman" w:hAnsi="Times New Roman" w:cs="Times New Roman"/>
@@ -737,23 +495,25 @@
           <w:lang w:val="en-US"/>
         </w:rPr>
         <w:tab/>
-        <w:t>Mã hồ sơ tỉnh quản lý:</w:t>
-      </w:r>
-      <w:r>
-        <w:rPr>
-          <w:rFonts w:ascii="Times New Roman" w:hAnsi="Times New Roman" w:cs="Times New Roman"/>
-          <w:color w:val="auto"/>
-          <w:lang w:val="en-US"/>
-        </w:rPr>
-        <w:t xml:space="preserve"> </w:t>
-      </w:r>
-      <w:r>
-        <w:rPr>
-          <w:rFonts w:ascii="Times New Roman" w:hAnsi="Times New Roman" w:cs="Times New Roman"/>
-          <w:color w:val="auto"/>
-          <w:lang w:val="en-US"/>
-        </w:rPr>
-        <w:t>…………………………..</w:t>
+        <w:t xml:space="preserve">Mã hồ sơ tỉnh quản </w:t>
+      </w:r>
+      <w:proofErr w:type="gramStart"/>
+      <w:r>
+        <w:rPr>
+          <w:rFonts w:ascii="Times New Roman" w:hAnsi="Times New Roman" w:cs="Times New Roman"/>
+          <w:color w:val="auto"/>
+          <w:lang w:val="en-US"/>
+        </w:rPr>
+        <w:t>lý:…</w:t>
+      </w:r>
+      <w:proofErr w:type="gramEnd"/>
+      <w:r>
+        <w:rPr>
+          <w:rFonts w:ascii="Times New Roman" w:hAnsi="Times New Roman" w:cs="Times New Roman"/>
+          <w:color w:val="auto"/>
+          <w:lang w:val="en-US"/>
+        </w:rPr>
+        <w:t>………………………..</w:t>
       </w:r>
     </w:p>
     <w:p>
@@ -761,7 +521,7 @@
         <w:tabs>
           <w:tab w:val="left" w:leader="dot" w:pos="6804"/>
         </w:tabs>
-        <w:spacing w:before="40" w:after="40" w:line="252" w:lineRule="auto"/>
+        <w:spacing w:before="40" w:after="40" w:line="276" w:lineRule="auto"/>
         <w:contextualSpacing/>
         <w:rPr>
           <w:rFonts w:ascii="Times New Roman" w:hAnsi="Times New Roman" w:cs="Times New Roman"/>
@@ -799,7 +559,7 @@
           <w:tab w:val="left" w:leader="dot" w:pos="5670"/>
           <w:tab w:val="left" w:leader="dot" w:pos="9072"/>
         </w:tabs>
-        <w:spacing w:before="40" w:after="40" w:line="252" w:lineRule="auto"/>
+        <w:spacing w:before="40" w:after="40" w:line="276" w:lineRule="auto"/>
         <w:contextualSpacing/>
         <w:rPr>
           <w:rFonts w:ascii="Times New Roman" w:hAnsi="Times New Roman" w:cs="Times New Roman"/>
@@ -823,12 +583,14 @@
         </w:rPr>
         <w:t>:</w:t>
       </w:r>
-      <w:r>
-        <w:rPr>
-          <w:rFonts w:ascii="Times New Roman" w:hAnsi="Times New Roman" w:cs="Times New Roman"/>
-          <w:color w:val="auto"/>
-          <w:lang w:val="en-US"/>
-        </w:rPr>
+      <w:proofErr w:type="gramStart"/>
+      <w:r>
+        <w:rPr>
+          <w:rFonts w:ascii="Times New Roman" w:hAnsi="Times New Roman" w:cs="Times New Roman"/>
+          <w:color w:val="auto"/>
+          <w:lang w:val="en-US"/>
+        </w:rPr>
+        <w:tab/>
         <w:t xml:space="preserve"> </w:t>
       </w:r>
       <w:r>
@@ -837,15 +599,16 @@
           <w:color w:val="auto"/>
           <w:lang w:val="en-US"/>
         </w:rPr>
-        <w:tab/>
-      </w:r>
-      <w:r>
-        <w:rPr>
-          <w:rFonts w:ascii="Times New Roman" w:hAnsi="Times New Roman" w:cs="Times New Roman"/>
-          <w:color w:val="auto"/>
-          <w:lang w:val="en-US"/>
-        </w:rPr>
-        <w:t>; Giới tí</w:t>
+        <w:t>;</w:t>
+      </w:r>
+      <w:proofErr w:type="gramEnd"/>
+      <w:r>
+        <w:rPr>
+          <w:rFonts w:ascii="Times New Roman" w:hAnsi="Times New Roman" w:cs="Times New Roman"/>
+          <w:color w:val="auto"/>
+          <w:lang w:val="en-US"/>
+        </w:rPr>
+        <w:t xml:space="preserve"> Giới tí</w:t>
       </w:r>
       <w:r>
         <w:rPr>
@@ -869,7 +632,7 @@
         <w:tabs>
           <w:tab w:val="left" w:leader="dot" w:pos="9072"/>
         </w:tabs>
-        <w:spacing w:before="40" w:after="40" w:line="252" w:lineRule="auto"/>
+        <w:spacing w:before="40" w:after="40" w:line="276" w:lineRule="auto"/>
         <w:contextualSpacing/>
         <w:rPr>
           <w:rFonts w:ascii="Times New Roman" w:hAnsi="Times New Roman" w:cs="Times New Roman"/>
@@ -906,7 +669,7 @@
         <w:tabs>
           <w:tab w:val="left" w:leader="dot" w:pos="9072"/>
         </w:tabs>
-        <w:spacing w:before="40" w:after="40" w:line="252" w:lineRule="auto"/>
+        <w:spacing w:before="40" w:after="40" w:line="276" w:lineRule="auto"/>
         <w:contextualSpacing/>
         <w:rPr>
           <w:rFonts w:ascii="Times New Roman" w:hAnsi="Times New Roman" w:cs="Times New Roman"/>
@@ -943,7 +706,7 @@
         <w:tabs>
           <w:tab w:val="left" w:leader="dot" w:pos="9072"/>
         </w:tabs>
-        <w:spacing w:before="40" w:after="40" w:line="252" w:lineRule="auto"/>
+        <w:spacing w:before="40" w:after="40" w:line="276" w:lineRule="auto"/>
         <w:contextualSpacing/>
         <w:rPr>
           <w:rFonts w:ascii="Times New Roman" w:hAnsi="Times New Roman" w:cs="Times New Roman"/>
@@ -980,7 +743,7 @@
         <w:tabs>
           <w:tab w:val="left" w:leader="dot" w:pos="9072"/>
         </w:tabs>
-        <w:spacing w:before="40" w:after="40" w:line="252" w:lineRule="auto"/>
+        <w:spacing w:before="40" w:after="40" w:line="276" w:lineRule="auto"/>
         <w:contextualSpacing/>
         <w:rPr>
           <w:rFonts w:ascii="Times New Roman" w:hAnsi="Times New Roman" w:cs="Times New Roman"/>
@@ -1009,7 +772,7 @@
         <w:tabs>
           <w:tab w:val="left" w:leader="dot" w:pos="9072"/>
         </w:tabs>
-        <w:spacing w:before="40" w:after="40" w:line="252" w:lineRule="auto"/>
+        <w:spacing w:before="40" w:after="40" w:line="276" w:lineRule="auto"/>
         <w:contextualSpacing/>
         <w:rPr>
           <w:rFonts w:ascii="Times New Roman" w:hAnsi="Times New Roman" w:cs="Times New Roman"/>
@@ -1047,7 +810,7 @@
         <w:tabs>
           <w:tab w:val="left" w:leader="dot" w:pos="9072"/>
         </w:tabs>
-        <w:spacing w:before="40" w:after="40" w:line="252" w:lineRule="auto"/>
+        <w:spacing w:before="40" w:after="40" w:line="276" w:lineRule="auto"/>
         <w:contextualSpacing/>
         <w:rPr>
           <w:rFonts w:ascii="Times New Roman" w:hAnsi="Times New Roman" w:cs="Times New Roman"/>
@@ -1090,7 +853,7 @@
     </w:p>
     <w:p>
       <w:pPr>
-        <w:spacing w:before="40" w:after="40" w:line="252" w:lineRule="auto"/>
+        <w:spacing w:before="40" w:after="40" w:line="276" w:lineRule="auto"/>
         <w:contextualSpacing/>
         <w:rPr>
           <w:rFonts w:ascii="Times New Roman" w:hAnsi="Times New Roman" w:cs="Times New Roman"/>
@@ -1141,7 +904,7 @@
         <w:tabs>
           <w:tab w:val="left" w:leader="dot" w:pos="9072"/>
         </w:tabs>
-        <w:spacing w:before="40" w:after="40" w:line="252" w:lineRule="auto"/>
+        <w:spacing w:before="40" w:after="40" w:line="276" w:lineRule="auto"/>
         <w:contextualSpacing/>
         <w:rPr>
           <w:rFonts w:ascii="Times New Roman" w:hAnsi="Times New Roman" w:cs="Times New Roman"/>
@@ -1179,7 +942,7 @@
         <w:tabs>
           <w:tab w:val="left" w:leader="dot" w:pos="9072"/>
         </w:tabs>
-        <w:spacing w:before="40" w:after="40" w:line="252" w:lineRule="auto"/>
+        <w:spacing w:before="40" w:after="40" w:line="276" w:lineRule="auto"/>
         <w:contextualSpacing/>
         <w:rPr>
           <w:rFonts w:ascii="Times New Roman" w:hAnsi="Times New Roman" w:cs="Times New Roman"/>
@@ -1217,7 +980,7 @@
         <w:tabs>
           <w:tab w:val="left" w:leader="dot" w:pos="9072"/>
         </w:tabs>
-        <w:spacing w:before="40" w:after="40" w:line="252" w:lineRule="auto"/>
+        <w:spacing w:before="40" w:after="40" w:line="276" w:lineRule="auto"/>
         <w:contextualSpacing/>
         <w:rPr>
           <w:rFonts w:ascii="Times New Roman" w:hAnsi="Times New Roman" w:cs="Times New Roman"/>
@@ -1231,23 +994,7 @@
           <w:color w:val="auto"/>
           <w:lang w:val="en-US"/>
         </w:rPr>
-        <w:t>Vợ</w:t>
-      </w:r>
-      <w:r>
-        <w:rPr>
-          <w:rFonts w:ascii="Times New Roman" w:hAnsi="Times New Roman" w:cs="Times New Roman"/>
-          <w:color w:val="auto"/>
-          <w:lang w:val="en-US"/>
-        </w:rPr>
-        <w:t>/Chồng</w:t>
-      </w:r>
-      <w:r>
-        <w:rPr>
-          <w:rFonts w:ascii="Times New Roman" w:hAnsi="Times New Roman" w:cs="Times New Roman"/>
-          <w:color w:val="auto"/>
-          <w:lang w:val="en-US"/>
-        </w:rPr>
-        <w:t>:</w:t>
+        <w:t>Vợ:</w:t>
       </w:r>
       <w:r>
         <w:rPr>
@@ -1271,11 +1018,13 @@
         <w:tabs>
           <w:tab w:val="left" w:leader="dot" w:pos="9072"/>
         </w:tabs>
-        <w:spacing w:before="40" w:after="40" w:line="252" w:lineRule="auto"/>
+        <w:spacing w:before="40" w:after="40" w:line="276" w:lineRule="auto"/>
         <w:contextualSpacing/>
+        <w:jc w:val="both"/>
         <w:rPr>
           <w:rFonts w:ascii="Times New Roman" w:hAnsi="Times New Roman" w:cs="Times New Roman"/>
           <w:b/>
+          <w:bCs/>
           <w:color w:val="auto"/>
           <w:lang w:val="en-US"/>
         </w:rPr>
@@ -1284,497 +1033,14 @@
         <w:rPr>
           <w:rFonts w:ascii="Times New Roman" w:hAnsi="Times New Roman" w:cs="Times New Roman"/>
           <w:b/>
-          <w:color w:val="auto"/>
-          <w:lang w:val="en-US"/>
-        </w:rPr>
-        <w:t>Thông tin về phần mộ liệt sĩ:</w:t>
-      </w:r>
-      <w:r>
-        <w:rPr>
-          <w:rFonts w:ascii="Times New Roman" w:hAnsi="Times New Roman" w:cs="Times New Roman"/>
-          <w:b/>
-          <w:color w:val="auto"/>
-          <w:lang w:val="en-US"/>
-        </w:rPr>
-        <w:t xml:space="preserve"> </w:t>
-      </w:r>
-      <w:r>
-        <w:rPr>
-          <w:rFonts w:ascii="Arial" w:hAnsi="Arial" w:cs="Arial"/>
-          <w:sz w:val="26"/>
-        </w:rPr>
-        <w:sym w:font="Wingdings 2" w:char="F0A3"/>
-      </w:r>
-      <w:r>
-        <w:rPr>
-          <w:rFonts w:ascii="Arial" w:hAnsi="Arial" w:cs="Arial"/>
-          <w:sz w:val="20"/>
-        </w:rPr>
-        <w:t xml:space="preserve">   </w:t>
-      </w:r>
-      <w:r>
-        <w:rPr>
-          <w:rFonts w:ascii="Arial" w:hAnsi="Arial" w:cs="Arial"/>
-          <w:sz w:val="20"/>
-          <w:lang w:val="en-US"/>
-        </w:rPr>
-        <w:t xml:space="preserve">Mộ có hài cốt liệt sĩ                </w:t>
-      </w:r>
-      <w:r>
-        <w:rPr>
-          <w:rFonts w:ascii="Arial" w:hAnsi="Arial" w:cs="Arial"/>
-          <w:sz w:val="26"/>
-        </w:rPr>
-        <w:sym w:font="Wingdings 2" w:char="F0A3"/>
-      </w:r>
-      <w:r>
-        <w:rPr>
-          <w:rFonts w:ascii="Arial" w:hAnsi="Arial" w:cs="Arial"/>
-          <w:sz w:val="20"/>
-        </w:rPr>
-        <w:t xml:space="preserve">   </w:t>
-      </w:r>
-      <w:r>
-        <w:rPr>
-          <w:rFonts w:ascii="Arial" w:hAnsi="Arial" w:cs="Arial"/>
-          <w:sz w:val="20"/>
-          <w:lang w:val="en-US"/>
-        </w:rPr>
-        <w:t>Mộ không có hài cốt liệt sĩ</w:t>
-      </w:r>
-    </w:p>
-    <w:p>
-      <w:pPr>
-        <w:tabs>
-          <w:tab w:val="left" w:leader="dot" w:pos="9072"/>
-        </w:tabs>
-        <w:spacing w:before="40" w:after="40" w:line="252" w:lineRule="auto"/>
-        <w:contextualSpacing/>
-        <w:rPr>
-          <w:rFonts w:ascii="Times New Roman" w:hAnsi="Times New Roman" w:cs="Times New Roman"/>
-          <w:color w:val="auto"/>
-          <w:lang w:val="en-US"/>
-        </w:rPr>
-      </w:pPr>
-      <w:r>
-        <w:rPr>
-          <w:rFonts w:ascii="Times New Roman" w:hAnsi="Times New Roman" w:cs="Times New Roman"/>
-          <w:color w:val="auto"/>
-          <w:lang w:val="en-US"/>
-        </w:rPr>
-        <w:t>Tên nghĩa trang:</w:t>
-      </w:r>
-      <w:r>
-        <w:rPr>
-          <w:rFonts w:ascii="Times New Roman" w:hAnsi="Times New Roman" w:cs="Times New Roman"/>
-          <w:color w:val="auto"/>
-          <w:lang w:val="en-US"/>
-        </w:rPr>
-        <w:tab/>
-      </w:r>
-    </w:p>
-    <w:p>
-      <w:pPr>
-        <w:tabs>
-          <w:tab w:val="left" w:leader="dot" w:pos="9072"/>
-        </w:tabs>
-        <w:spacing w:before="40" w:after="40" w:line="252" w:lineRule="auto"/>
-        <w:contextualSpacing/>
-        <w:rPr>
-          <w:rFonts w:ascii="Times New Roman" w:hAnsi="Times New Roman" w:cs="Times New Roman"/>
-          <w:color w:val="auto"/>
-          <w:lang w:val="en-US"/>
-        </w:rPr>
-      </w:pPr>
-      <w:r>
-        <w:rPr>
-          <w:rFonts w:ascii="Arial" w:hAnsi="Arial" w:cs="Arial"/>
-          <w:sz w:val="26"/>
-        </w:rPr>
-        <w:sym w:font="Wingdings 2" w:char="F0A3"/>
-      </w:r>
-      <w:r>
-        <w:rPr>
-          <w:rFonts w:ascii="Arial" w:hAnsi="Arial" w:cs="Arial"/>
-          <w:sz w:val="20"/>
-        </w:rPr>
-        <w:t xml:space="preserve">   </w:t>
-      </w:r>
-      <w:r>
-        <w:rPr>
-          <w:rFonts w:ascii="Arial" w:hAnsi="Arial" w:cs="Arial"/>
-          <w:sz w:val="20"/>
-        </w:rPr>
-        <w:t>Nghĩa trang liệ</w:t>
-      </w:r>
-      <w:r>
-        <w:rPr>
-          <w:rFonts w:ascii="Arial" w:hAnsi="Arial" w:cs="Arial"/>
-          <w:sz w:val="20"/>
-        </w:rPr>
-        <w:t xml:space="preserve">t sĩ  </w:t>
-      </w:r>
-      <w:r>
-        <w:rPr>
-          <w:rFonts w:ascii="Arial" w:hAnsi="Arial" w:cs="Arial"/>
-          <w:sz w:val="20"/>
-          <w:lang w:val="en-US"/>
-        </w:rPr>
-        <w:t xml:space="preserve">                                                                       </w:t>
-      </w:r>
-      <w:r>
-        <w:rPr>
-          <w:rFonts w:ascii="Arial" w:hAnsi="Arial" w:cs="Arial"/>
-          <w:sz w:val="20"/>
-        </w:rPr>
-        <w:t xml:space="preserve">      </w:t>
-      </w:r>
-      <w:r>
-        <w:rPr>
-          <w:rFonts w:ascii="Arial" w:hAnsi="Arial" w:cs="Arial"/>
-          <w:sz w:val="26"/>
-        </w:rPr>
-        <w:sym w:font="Wingdings 2" w:char="F0A3"/>
-      </w:r>
-      <w:r>
-        <w:rPr>
-          <w:rFonts w:ascii="Arial" w:hAnsi="Arial" w:cs="Arial"/>
-          <w:sz w:val="20"/>
-        </w:rPr>
-        <w:t xml:space="preserve">   </w:t>
-      </w:r>
-      <w:r>
-        <w:rPr>
-          <w:rFonts w:ascii="Arial" w:hAnsi="Arial" w:cs="Arial"/>
-          <w:sz w:val="20"/>
-          <w:lang w:val="en-US"/>
-        </w:rPr>
-        <w:t>N</w:t>
-      </w:r>
-      <w:r>
-        <w:rPr>
-          <w:rFonts w:ascii="Arial" w:hAnsi="Arial" w:cs="Arial"/>
-          <w:sz w:val="20"/>
-        </w:rPr>
-        <w:t>goài nghĩa trang liệt s</w:t>
-      </w:r>
-      <w:r>
-        <w:rPr>
-          <w:rFonts w:ascii="Arial" w:hAnsi="Arial" w:cs="Arial"/>
-          <w:sz w:val="20"/>
-          <w:lang w:val="en-US"/>
-        </w:rPr>
-        <w:t>ĩ</w:t>
-      </w:r>
-      <w:r>
-        <w:rPr>
-          <w:rFonts w:ascii="Arial" w:hAnsi="Arial" w:cs="Arial"/>
-          <w:sz w:val="20"/>
-        </w:rPr>
-        <w:t xml:space="preserve"> </w:t>
-      </w:r>
-    </w:p>
-    <w:p>
-      <w:pPr>
-        <w:tabs>
-          <w:tab w:val="left" w:leader="dot" w:pos="9072"/>
-        </w:tabs>
-        <w:spacing w:before="40" w:after="40" w:line="252" w:lineRule="auto"/>
-        <w:contextualSpacing/>
-        <w:rPr>
-          <w:rFonts w:ascii="Times New Roman" w:hAnsi="Times New Roman" w:cs="Times New Roman"/>
-          <w:color w:val="auto"/>
-          <w:lang w:val="en-US"/>
-        </w:rPr>
-      </w:pPr>
-      <w:r>
-        <w:rPr>
-          <w:rFonts w:ascii="Times New Roman" w:hAnsi="Times New Roman" w:cs="Times New Roman"/>
-          <w:color w:val="auto"/>
-          <w:lang w:val="en-US"/>
-        </w:rPr>
-        <w:t>Nghĩa trang thuộc tỉnh/thành phố</w:t>
-      </w:r>
-      <w:r>
-        <w:rPr>
-          <w:rFonts w:ascii="Times New Roman" w:hAnsi="Times New Roman" w:cs="Times New Roman"/>
-          <w:color w:val="auto"/>
-          <w:lang w:val="en-US"/>
-        </w:rPr>
-        <w:t xml:space="preserve"> (</w:t>
-      </w:r>
-      <w:r>
-        <w:rPr>
-          <w:rFonts w:ascii="Arial" w:hAnsi="Arial" w:cs="Arial"/>
-          <w:sz w:val="20"/>
-        </w:rPr>
-        <w:t xml:space="preserve">ghi rõ </w:t>
-      </w:r>
-      <w:r>
-        <w:rPr>
-          <w:rFonts w:ascii="Arial" w:hAnsi="Arial" w:cs="Arial"/>
-          <w:sz w:val="20"/>
-          <w:lang w:val="en-US"/>
-        </w:rPr>
-        <w:t>địa chỉ chi tiết</w:t>
-      </w:r>
-      <w:r>
-        <w:rPr>
-          <w:rFonts w:ascii="Arial" w:hAnsi="Arial" w:cs="Arial"/>
-          <w:sz w:val="20"/>
-        </w:rPr>
-        <w:t>, xã, huyện, tỉ</w:t>
-      </w:r>
-      <w:r>
-        <w:rPr>
-          <w:rFonts w:ascii="Arial" w:hAnsi="Arial" w:cs="Arial"/>
-          <w:sz w:val="20"/>
-        </w:rPr>
-        <w:t>nh</w:t>
-      </w:r>
-      <w:r>
-        <w:rPr>
-          <w:rFonts w:ascii="Times New Roman" w:hAnsi="Times New Roman" w:cs="Times New Roman"/>
-          <w:color w:val="auto"/>
-          <w:lang w:val="en-US"/>
-        </w:rPr>
-        <w:t>)</w:t>
-      </w:r>
-      <w:r>
-        <w:rPr>
-          <w:rFonts w:ascii="Times New Roman" w:hAnsi="Times New Roman" w:cs="Times New Roman"/>
-          <w:color w:val="auto"/>
-          <w:lang w:val="en-US"/>
-        </w:rPr>
-        <w:t>:</w:t>
-      </w:r>
-      <w:r>
-        <w:rPr>
-          <w:rFonts w:ascii="Times New Roman" w:hAnsi="Times New Roman" w:cs="Times New Roman"/>
-          <w:color w:val="auto"/>
-          <w:lang w:val="en-US"/>
-        </w:rPr>
-        <w:tab/>
-      </w:r>
-    </w:p>
-    <w:p>
-      <w:pPr>
-        <w:tabs>
-          <w:tab w:val="left" w:leader="dot" w:pos="9072"/>
-        </w:tabs>
-        <w:spacing w:before="40" w:after="40" w:line="252" w:lineRule="auto"/>
-        <w:contextualSpacing/>
-        <w:rPr>
-          <w:rFonts w:ascii="Times New Roman" w:hAnsi="Times New Roman" w:cs="Times New Roman"/>
-          <w:color w:val="auto"/>
-          <w:lang w:val="en-US"/>
-        </w:rPr>
-      </w:pPr>
-      <w:r>
-        <w:rPr>
-          <w:rFonts w:ascii="Times New Roman" w:hAnsi="Times New Roman" w:cs="Times New Roman"/>
-          <w:color w:val="auto"/>
-          <w:lang w:val="en-US"/>
-        </w:rPr>
-        <w:tab/>
-      </w:r>
-    </w:p>
-    <w:p>
-      <w:pPr>
-        <w:tabs>
-          <w:tab w:val="left" w:leader="dot" w:pos="9072"/>
-        </w:tabs>
-        <w:spacing w:before="40" w:after="40" w:line="252" w:lineRule="auto"/>
-        <w:contextualSpacing/>
-        <w:rPr>
-          <w:rFonts w:ascii="Times New Roman" w:hAnsi="Times New Roman" w:cs="Times New Roman"/>
-          <w:color w:val="auto"/>
-          <w:lang w:val="en-US"/>
-        </w:rPr>
-      </w:pPr>
-      <w:r>
-        <w:rPr>
-          <w:rFonts w:ascii="Times New Roman" w:hAnsi="Times New Roman" w:cs="Times New Roman"/>
-          <w:color w:val="auto"/>
-          <w:lang w:val="en-US"/>
-        </w:rPr>
-        <w:t>Địa điểm</w:t>
-      </w:r>
-      <w:r>
-        <w:rPr>
-          <w:rFonts w:ascii="Times New Roman" w:hAnsi="Times New Roman" w:cs="Times New Roman"/>
-          <w:color w:val="auto"/>
-          <w:lang w:val="en-US"/>
-        </w:rPr>
-        <w:t xml:space="preserve"> quy tập hoặc an táng hài cốt trước khi tiếp nhận</w:t>
-      </w:r>
-      <w:r>
-        <w:rPr>
-          <w:rFonts w:ascii="Times New Roman" w:hAnsi="Times New Roman" w:cs="Times New Roman"/>
-          <w:color w:val="auto"/>
-          <w:lang w:val="en-US"/>
-        </w:rPr>
-        <w:t>:</w:t>
-      </w:r>
-      <w:r>
-        <w:rPr>
-          <w:rFonts w:ascii="Times New Roman" w:hAnsi="Times New Roman" w:cs="Times New Roman"/>
-          <w:color w:val="auto"/>
-          <w:lang w:val="en-US"/>
-        </w:rPr>
-        <w:tab/>
-      </w:r>
-    </w:p>
-    <w:p>
-      <w:pPr>
-        <w:tabs>
-          <w:tab w:val="left" w:leader="dot" w:pos="9072"/>
-        </w:tabs>
-        <w:spacing w:before="40" w:after="40" w:line="252" w:lineRule="auto"/>
-        <w:contextualSpacing/>
-        <w:rPr>
-          <w:rFonts w:ascii="Times New Roman" w:hAnsi="Times New Roman" w:cs="Times New Roman"/>
-          <w:color w:val="auto"/>
-          <w:lang w:val="en-US"/>
-        </w:rPr>
-      </w:pPr>
-      <w:r>
-        <w:rPr>
-          <w:rFonts w:ascii="Times New Roman" w:hAnsi="Times New Roman" w:cs="Times New Roman"/>
-          <w:color w:val="auto"/>
-          <w:lang w:val="en-US"/>
-        </w:rPr>
-        <w:t>Đơn vị</w:t>
-      </w:r>
-      <w:r>
-        <w:rPr>
-          <w:rFonts w:ascii="Times New Roman" w:hAnsi="Times New Roman" w:cs="Times New Roman"/>
-          <w:color w:val="auto"/>
-          <w:lang w:val="en-US"/>
-        </w:rPr>
-        <w:t xml:space="preserve"> quy tập hoặc an táng hài cốt trước khi tiếp nhận</w:t>
-      </w:r>
-      <w:r>
-        <w:rPr>
-          <w:rFonts w:ascii="Times New Roman" w:hAnsi="Times New Roman" w:cs="Times New Roman"/>
-          <w:color w:val="auto"/>
-          <w:lang w:val="en-US"/>
-        </w:rPr>
-        <w:t>:</w:t>
-      </w:r>
-      <w:r>
-        <w:rPr>
-          <w:rFonts w:ascii="Times New Roman" w:hAnsi="Times New Roman" w:cs="Times New Roman"/>
-          <w:color w:val="auto"/>
-          <w:lang w:val="en-US"/>
-        </w:rPr>
-        <w:tab/>
-      </w:r>
-    </w:p>
-    <w:p>
-      <w:pPr>
-        <w:tabs>
-          <w:tab w:val="left" w:leader="dot" w:pos="9072"/>
-        </w:tabs>
-        <w:spacing w:before="40" w:after="40" w:line="252" w:lineRule="auto"/>
-        <w:contextualSpacing/>
-        <w:rPr>
-          <w:rFonts w:ascii="Times New Roman" w:hAnsi="Times New Roman" w:cs="Times New Roman"/>
-          <w:color w:val="auto"/>
-          <w:lang w:val="en-US"/>
-        </w:rPr>
-      </w:pPr>
-      <w:r>
-        <w:rPr>
-          <w:rFonts w:ascii="Times New Roman" w:hAnsi="Times New Roman" w:cs="Times New Roman"/>
-          <w:color w:val="auto"/>
-          <w:lang w:val="en-US"/>
-        </w:rPr>
-        <w:t>Thời gian đưa vào an táng trong nghĩa trang liệt sĩ:</w:t>
-      </w:r>
-      <w:r>
-        <w:rPr>
-          <w:rFonts w:ascii="Times New Roman" w:hAnsi="Times New Roman" w:cs="Times New Roman"/>
-          <w:color w:val="auto"/>
-          <w:lang w:val="en-US"/>
-        </w:rPr>
-        <w:tab/>
-      </w:r>
-    </w:p>
-    <w:p>
-      <w:pPr>
-        <w:tabs>
-          <w:tab w:val="left" w:leader="dot" w:pos="9072"/>
-        </w:tabs>
-        <w:spacing w:before="40" w:after="40" w:line="252" w:lineRule="auto"/>
-        <w:contextualSpacing/>
-        <w:rPr>
-          <w:rFonts w:ascii="Times New Roman" w:hAnsi="Times New Roman" w:cs="Times New Roman"/>
-          <w:color w:val="auto"/>
-          <w:lang w:val="en-US"/>
-        </w:rPr>
-      </w:pPr>
-      <w:r>
-        <w:rPr>
-          <w:rFonts w:ascii="Times New Roman" w:hAnsi="Times New Roman" w:cs="Times New Roman"/>
-          <w:color w:val="auto"/>
-          <w:lang w:val="en-US"/>
-        </w:rPr>
-        <w:t xml:space="preserve">Vị trí </w:t>
-      </w:r>
-      <w:r>
-        <w:rPr>
-          <w:rFonts w:ascii="Times New Roman" w:hAnsi="Times New Roman" w:cs="Times New Roman"/>
-          <w:color w:val="auto"/>
-          <w:lang w:val="en-US"/>
-        </w:rPr>
-        <w:t>mộ</w:t>
-      </w:r>
-      <w:r>
-        <w:rPr>
-          <w:rFonts w:ascii="Times New Roman" w:hAnsi="Times New Roman" w:cs="Times New Roman"/>
-          <w:color w:val="auto"/>
-          <w:lang w:val="en-US"/>
-        </w:rPr>
-        <w:t xml:space="preserve"> trong nghĩa trang liệt sĩ: Số mộ...., hàng......., lô...., khu</w:t>
-      </w:r>
-      <w:r>
-        <w:rPr>
-          <w:rFonts w:ascii="Times New Roman" w:hAnsi="Times New Roman" w:cs="Times New Roman"/>
-          <w:color w:val="auto"/>
-          <w:lang w:val="en-US"/>
-        </w:rPr>
-        <w:t xml:space="preserve"> </w:t>
-      </w:r>
-      <w:r>
-        <w:rPr>
-          <w:rFonts w:ascii="Times New Roman" w:hAnsi="Times New Roman" w:cs="Times New Roman"/>
-          <w:color w:val="auto"/>
-          <w:lang w:val="en-US"/>
-        </w:rPr>
-        <w:t>...................................</w:t>
-      </w:r>
-      <w:r>
-        <w:rPr>
-          <w:rFonts w:ascii="Times New Roman" w:hAnsi="Times New Roman" w:cs="Times New Roman"/>
-          <w:color w:val="auto"/>
-          <w:lang w:val="en-US"/>
-        </w:rPr>
-        <w:t>...</w:t>
-      </w:r>
-      <w:r>
-        <w:rPr>
-          <w:rFonts w:ascii="Times New Roman" w:hAnsi="Times New Roman" w:cs="Times New Roman"/>
-          <w:color w:val="auto"/>
-          <w:lang w:val="en-US"/>
-        </w:rPr>
-        <w:t>.</w:t>
+        </w:rPr>
+        <w:t xml:space="preserve">3. Thông tin phần mộ liệt sĩ đã xác định:</w:t>
       </w:r>
     </w:p>
     <w:tbl>
       <w:tblPr>
         <w:tblStyle w:val="TableGrid"/>
-        <w:tblW w:w="14142" w:type="dxa"/>
+        <w:tblW w:w="9481" w:type="dxa"/>
         <w:tblBorders>
           <w:top w:val="none" w:sz="0" w:space="0" w:color="auto"/>
           <w:left w:val="none" w:sz="0" w:space="0" w:color="auto"/>
@@ -1788,7 +1054,6 @@
       <w:tblGrid>
         <w:gridCol w:w="4820"/>
         <w:gridCol w:w="4661"/>
-        <w:gridCol w:w="4661"/>
       </w:tblGrid>
       <w:tr>
         <w:tc>
@@ -1914,6 +1179,17 @@
               </w:rPr>
               <w:t>Họ và tên</w:t>
             </w:r>
+          </w:p>
+          <w:p>
+            <w:pPr>
+              <w:spacing w:before="120"/>
+              <w:rPr>
+                <w:rFonts w:ascii="Times New Roman" w:hAnsi="Times New Roman" w:cs="Times New Roman"/>
+                <w:i/>
+                <w:color w:val="auto"/>
+                <w:lang w:val="en-US"/>
+              </w:rPr>
+            </w:pPr>
           </w:p>
           <w:p>
             <w:pPr>
@@ -2131,11 +1407,6 @@
               </w:rPr>
             </w:pPr>
           </w:p>
-        </w:tc>
-        <w:tc>
-          <w:tcPr>
-            <w:tcW w:w="4661" w:type="dxa"/>
-          </w:tcPr>
           <w:p>
             <w:pPr>
               <w:spacing w:before="120"/>
@@ -2144,6 +1415,31 @@
                 <w:rFonts w:ascii="Times New Roman" w:hAnsi="Times New Roman" w:cs="Times New Roman"/>
                 <w:i/>
                 <w:color w:val="auto"/>
+                <w:lang w:val="en-US"/>
+              </w:rPr>
+            </w:pPr>
+          </w:p>
+          <w:p>
+            <w:pPr>
+              <w:spacing w:before="120"/>
+              <w:jc w:val="center"/>
+              <w:rPr>
+                <w:rFonts w:ascii="Times New Roman" w:hAnsi="Times New Roman" w:cs="Times New Roman"/>
+                <w:i/>
+                <w:color w:val="auto"/>
+                <w:lang w:val="en-US"/>
+              </w:rPr>
+            </w:pPr>
+          </w:p>
+          <w:p>
+            <w:pPr>
+              <w:spacing w:before="120"/>
+              <w:jc w:val="center"/>
+              <w:rPr>
+                <w:rFonts w:ascii="Times New Roman" w:hAnsi="Times New Roman" w:cs="Times New Roman"/>
+                <w:i/>
+                <w:color w:val="auto"/>
+                <w:lang w:val="en-US"/>
               </w:rPr>
             </w:pPr>
           </w:p>
@@ -2157,7 +1453,6 @@
           </w:tcPr>
           <w:p>
             <w:pPr>
-              <w:spacing w:before="120"/>
               <w:jc w:val="center"/>
               <w:rPr>
                 <w:rFonts w:ascii="Times New Roman" w:hAnsi="Times New Roman" w:cs="Times New Roman"/>
@@ -2202,15 +1497,7 @@
                 <w:color w:val="auto"/>
                 <w:lang w:val="en-US"/>
               </w:rPr>
-              <w:t>Nội vụ n</w:t>
-            </w:r>
-            <w:r>
-              <w:rPr>
-                <w:rFonts w:ascii="Times New Roman" w:hAnsi="Times New Roman" w:cs="Times New Roman"/>
-                <w:color w:val="auto"/>
-                <w:lang w:val="en-US"/>
-              </w:rPr>
-              <w:t xml:space="preserve">ội dung khai </w:t>
+              <w:t xml:space="preserve">Nội vụ </w:t>
             </w:r>
             <w:r>
               <w:rPr>
@@ -2284,22 +1571,6 @@
               <w:t>Họ và tên</w:t>
             </w:r>
           </w:p>
-          <w:p>
-            <w:pPr>
-              <w:spacing w:before="120"/>
-              <w:jc w:val="center"/>
-              <w:rPr>
-                <w:rFonts w:ascii="Times New Roman" w:hAnsi="Times New Roman" w:cs="Times New Roman"/>
-                <w:i/>
-                <w:color w:val="auto"/>
-              </w:rPr>
-            </w:pPr>
-          </w:p>
-        </w:tc>
-        <w:tc>
-          <w:tcPr>
-            <w:tcW w:w="4661" w:type="dxa"/>
-          </w:tcPr>
           <w:p>
             <w:pPr>
               <w:spacing w:before="120"/>
@@ -2325,7 +1596,7 @@
         </w:rPr>
         <w:sectPr>
           <w:pgSz w:w="11906" w:h="16838" w:code="9"/>
-          <w:pgMar w:top="567" w:right="1134" w:bottom="567" w:left="1418" w:header="709" w:footer="709" w:gutter="0"/>
+          <w:pgMar w:top="851" w:right="1134" w:bottom="1134" w:left="1418" w:header="709" w:footer="709" w:gutter="0"/>
           <w:cols w:space="708"/>
           <w:docGrid w:linePitch="360"/>
         </w:sectPr>
@@ -2351,7 +1622,7 @@
         <w:tblLook w:val="01E0" w:firstRow="1" w:lastRow="1" w:firstColumn="1" w:lastColumn="1" w:noHBand="0" w:noVBand="0"/>
       </w:tblPr>
       <w:tblGrid>
-        <w:gridCol w:w="13465"/>
+        <w:gridCol w:w="14502"/>
       </w:tblGrid>
       <w:tr>
         <w:trPr>
@@ -2382,6 +1653,703 @@
         <w:jc w:val="center"/>
         <w:rPr>
           <w:rFonts w:ascii="Times New Roman" w:hAnsi="Times New Roman" w:cs="Times New Roman"/>
+          <w:b/>
+          <w:bCs/>
+          <w:color w:val="auto"/>
+          <w:lang w:val="en-US"/>
+        </w:rPr>
+      </w:pPr>
+      <w:r>
+        <w:rPr>
+          <w:rFonts w:ascii="Times New Roman" w:hAnsi="Times New Roman" w:cs="Times New Roman"/>
+          <w:b/>
+          <w:bCs/>
+          <w:color w:val="auto"/>
+          <w:lang w:val="en-US"/>
+        </w:rPr>
+        <w:t>PHỤ LỤC 1: Thông tin thân nhân l</w:t>
+      </w:r>
+      <w:r>
+        <w:rPr>
+          <w:rFonts w:ascii="Times New Roman" w:hAnsi="Times New Roman" w:cs="Times New Roman"/>
+          <w:b/>
+          <w:bCs/>
+          <w:color w:val="auto"/>
+        </w:rPr>
+        <w:t>iệt sĩ</w:t>
+      </w:r>
+      <w:r>
+        <w:rPr>
+          <w:rFonts w:ascii="Times New Roman" w:hAnsi="Times New Roman" w:cs="Times New Roman"/>
+          <w:b/>
+          <w:bCs/>
+          <w:color w:val="auto"/>
+          <w:lang w:val="en-US"/>
+        </w:rPr>
+        <w:t xml:space="preserve"> </w:t>
+      </w:r>
+      <w:r>
+        <w:rPr>
+          <w:rFonts w:ascii="Times New Roman" w:hAnsi="Times New Roman" w:cs="Times New Roman"/>
+          <w:b/>
+          <w:bCs/>
+          <w:color w:val="auto"/>
+          <w:lang w:val="en-US"/>
+        </w:rPr>
+        <w:t xml:space="preserve">chưa xác định được danh tính </w:t>
+      </w:r>
+      <w:r>
+        <w:rPr>
+          <w:rFonts w:ascii="Times New Roman" w:hAnsi="Times New Roman" w:cs="Times New Roman"/>
+          <w:b/>
+          <w:bCs/>
+          <w:color w:val="auto"/>
+          <w:lang w:val="en-US"/>
+        </w:rPr>
+        <w:t xml:space="preserve">theo </w:t>
+      </w:r>
+      <w:r>
+        <w:rPr>
+          <w:rFonts w:ascii="Times New Roman" w:hAnsi="Times New Roman" w:cs="Times New Roman"/>
+          <w:b/>
+          <w:bCs/>
+          <w:color w:val="auto"/>
+          <w:lang w:val="en-US"/>
+        </w:rPr>
+        <w:t>họ ngoại</w:t>
+      </w:r>
+    </w:p>
+    <w:p>
+      <w:pPr>
+        <w:spacing w:before="120"/>
+        <w:rPr>
+          <w:rFonts w:ascii="Times New Roman" w:hAnsi="Times New Roman" w:cs="Times New Roman"/>
+          <w:color w:val="auto"/>
+          <w:sz w:val="20"/>
+          <w:lang w:val="en-US"/>
+        </w:rPr>
+      </w:pPr>
+    </w:p>
+    <w:tbl>
+      <w:tblPr>
+        <w:tblpPr w:leftFromText="180" w:rightFromText="180" w:vertAnchor="text" w:horzAnchor="margin" w:tblpX="-572" w:tblpYSpec="bottom"/>
+        <w:tblW w:w="5471" w:type="pct"/>
+        <w:tblLayout w:type="fixed"/>
+        <w:tblCellMar>
+          <w:left w:w="0" w:type="dxa"/>
+          <w:right w:w="0" w:type="dxa"/>
+        </w:tblCellMar>
+        <w:tblLook w:val="0000" w:firstRow="0" w:lastRow="0" w:firstColumn="0" w:lastColumn="0" w:noHBand="0" w:noVBand="0"/>
+      </w:tblPr>
+      <w:tblGrid>
+        <w:gridCol w:w="421"/>
+        <w:gridCol w:w="1404"/>
+        <w:gridCol w:w="1386"/>
+        <w:gridCol w:w="1212"/>
+        <w:gridCol w:w="610"/>
+        <w:gridCol w:w="1276"/>
+        <w:gridCol w:w="1319"/>
+        <w:gridCol w:w="1221"/>
+        <w:gridCol w:w="2137"/>
+        <w:gridCol w:w="1834"/>
+        <w:gridCol w:w="2442"/>
+      </w:tblGrid>
+      <w:tr>
+        <w:tc>
+          <w:p>
+            <w:r>
+              <w:rPr>
+                <w:b/>
+                <w:rFonts w:ascii="Times New Roman" w:hAnsi="Times New Roman"/>
+              </w:rPr>
+              <w:t>Hình thức an táng:</w:t>
+            </w:r>
+          </w:p>
+        </w:tc>
+        <w:tc>
+          <w:p>
+            <w:r>
+              <w:rPr>
+                <w:rFonts w:ascii="Times New Roman" w:hAnsi="Times New Roman"/>
+              </w:rPr>
+              <w:t/>
+            </w:r>
+          </w:p>
+        </w:tc>
+      </w:tr>
+      <w:tr>
+        <w:tc>
+          <w:p>
+            <w:r>
+              <w:rPr>
+                <w:b/>
+                <w:rFonts w:ascii="Times New Roman" w:hAnsi="Times New Roman"/>
+              </w:rPr>
+              <w:t>Tên nghĩa trang liệt sĩ / Nơi an táng:</w:t>
+            </w:r>
+          </w:p>
+        </w:tc>
+        <w:tc>
+          <w:p>
+            <w:r>
+              <w:rPr>
+                <w:rFonts w:ascii="Times New Roman" w:hAnsi="Times New Roman"/>
+              </w:rPr>
+              <w:t/>
+            </w:r>
+          </w:p>
+        </w:tc>
+      </w:tr>
+      <w:tr>
+        <w:tc>
+          <w:p>
+            <w:r>
+              <w:rPr>
+                <w:b/>
+                <w:rFonts w:ascii="Times New Roman" w:hAnsi="Times New Roman"/>
+              </w:rPr>
+              <w:t>Địa chỉ nghĩa trang / Nơi an táng:</w:t>
+            </w:r>
+          </w:p>
+        </w:tc>
+        <w:tc>
+          <w:p>
+            <w:r>
+              <w:rPr>
+                <w:rFonts w:ascii="Times New Roman" w:hAnsi="Times New Roman"/>
+              </w:rPr>
+              <w:t/>
+            </w:r>
+          </w:p>
+        </w:tc>
+      </w:tr>
+      <w:tr>
+        <w:tc>
+          <w:p>
+            <w:r>
+              <w:rPr>
+                <w:b/>
+                <w:rFonts w:ascii="Times New Roman" w:hAnsi="Times New Roman"/>
+              </w:rPr>
+              <w:t>Vị trí mộ cụ thể (Khu, Lô, Hàng, Số mộ):</w:t>
+            </w:r>
+          </w:p>
+        </w:tc>
+        <w:tc>
+          <w:p>
+            <w:r>
+              <w:rPr>
+                <w:rFonts w:ascii="Times New Roman" w:hAnsi="Times New Roman"/>
+              </w:rPr>
+              <w:t/>
+            </w:r>
+          </w:p>
+        </w:tc>
+      </w:tr>
+      <w:tr>
+        <w:tc>
+          <w:p>
+            <w:r>
+              <w:rPr>
+                <w:b/>
+                <w:rFonts w:ascii="Times New Roman" w:hAnsi="Times New Roman"/>
+              </w:rPr>
+              <w:t>Thông tin ghi trên bia mộ:</w:t>
+            </w:r>
+          </w:p>
+        </w:tc>
+        <w:tc>
+          <w:p>
+            <w:r>
+              <w:rPr>
+                <w:rFonts w:ascii="Times New Roman" w:hAnsi="Times New Roman"/>
+              </w:rPr>
+              <w:t/>
+            </w:r>
+          </w:p>
+        </w:tc>
+      </w:tr>
+      <w:tr>
+        <w:tc>
+          <w:p>
+            <w:r>
+              <w:rPr>
+                <w:b/>
+                <w:rFonts w:ascii="Times New Roman" w:hAnsi="Times New Roman"/>
+              </w:rPr>
+              <w:t>Nội dung cụ thể trên bia mộ:</w:t>
+            </w:r>
+          </w:p>
+        </w:tc>
+        <w:tc>
+          <w:p>
+            <w:r>
+              <w:rPr>
+                <w:rFonts w:ascii="Times New Roman" w:hAnsi="Times New Roman"/>
+              </w:rPr>
+              <w:t/>
+            </w:r>
+          </w:p>
+        </w:tc>
+      </w:tr>
+      <w:tr>
+        <w:tc>
+          <w:p>
+            <w:r>
+              <w:rPr>
+                <w:b/>
+                <w:rFonts w:ascii="Times New Roman" w:hAnsi="Times New Roman"/>
+              </w:rPr>
+              <w:t>Tình trạng hài cốt trong mộ:</w:t>
+            </w:r>
+          </w:p>
+        </w:tc>
+        <w:tc>
+          <w:p>
+            <w:r>
+              <w:rPr>
+                <w:rFonts w:ascii="Times New Roman" w:hAnsi="Times New Roman"/>
+              </w:rPr>
+              <w:t/>
+            </w:r>
+          </w:p>
+        </w:tc>
+      </w:tr>
+      <w:tr>
+        <w:tc>
+          <w:p>
+            <w:r>
+              <w:rPr>
+                <w:b/>
+                <w:rFonts w:ascii="Times New Roman" w:hAnsi="Times New Roman"/>
+              </w:rPr>
+              <w:t>Tình trạng quy tập:</w:t>
+            </w:r>
+          </w:p>
+        </w:tc>
+        <w:tc>
+          <w:p>
+            <w:r>
+              <w:rPr>
+                <w:rFonts w:ascii="Times New Roman" w:hAnsi="Times New Roman"/>
+              </w:rPr>
+              <w:t/>
+            </w:r>
+          </w:p>
+        </w:tc>
+      </w:tr>
+      <w:tr>
+        <w:tc>
+          <w:p>
+            <w:r>
+              <w:rPr>
+                <w:b/>
+                <w:rFonts w:ascii="Times New Roman" w:hAnsi="Times New Roman"/>
+              </w:rPr>
+              <w:t>Ghi chú về phần mộ / Di vật:</w:t>
+            </w:r>
+          </w:p>
+        </w:tc>
+        <w:tc>
+          <w:p>
+            <w:r>
+              <w:rPr>
+                <w:rFonts w:ascii="Times New Roman" w:hAnsi="Times New Roman"/>
+              </w:rPr>
+              <w:t/>
+            </w:r>
+          </w:p>
+        </w:tc>
+      </w:tr>
+    </w:tbl>
+    <w:tbl>
+      <w:tblPr>
+        <w:tblStyle w:val="TableGrid"/>
+        <w:tblW w:w="0" w:type="auto"/>
+        <w:tblInd w:w="-289" w:type="dxa"/>
+        <w:tblBorders>
+          <w:top w:val="none" w:sz="0" w:space="0" w:color="auto"/>
+          <w:left w:val="none" w:sz="0" w:space="0" w:color="auto"/>
+          <w:bottom w:val="none" w:sz="0" w:space="0" w:color="auto"/>
+          <w:right w:val="none" w:sz="0" w:space="0" w:color="auto"/>
+          <w:insideH w:val="none" w:sz="0" w:space="0" w:color="auto"/>
+          <w:insideV w:val="none" w:sz="0" w:space="0" w:color="auto"/>
+        </w:tblBorders>
+        <w:tblLook w:val="04A0" w:firstRow="1" w:lastRow="0" w:firstColumn="1" w:lastColumn="0" w:noHBand="0" w:noVBand="1"/>
+      </w:tblPr>
+      <w:tblGrid>
+        <w:gridCol w:w="861"/>
+        <w:gridCol w:w="12378"/>
+      </w:tblGrid>
+      <w:tr>
+        <w:tc>
+          <w:tcPr>
+            <w:tcW w:w="861" w:type="dxa"/>
+          </w:tcPr>
+          <w:p>
+            <w:pPr>
+              <w:jc w:val="right"/>
+              <w:rPr>
+                <w:rFonts w:ascii="Times New Roman" w:hAnsi="Times New Roman" w:cs="Times New Roman"/>
+                <w:lang w:val="en-US"/>
+              </w:rPr>
+            </w:pPr>
+            <w:r>
+              <w:rPr>
+                <w:rFonts w:ascii="Times New Roman" w:hAnsi="Times New Roman" w:cs="Times New Roman"/>
+                <w:b/>
+                <w:i/>
+                <w:color w:val="auto"/>
+                <w:lang w:val="en-US"/>
+              </w:rPr>
+              <w:t>Chú ý:</w:t>
+            </w:r>
+          </w:p>
+        </w:tc>
+        <w:tc>
+          <w:tcPr>
+            <w:tcW w:w="12378" w:type="dxa"/>
+          </w:tcPr>
+          <w:p>
+            <w:pPr>
+              <w:ind w:left="-113"/>
+              <w:jc w:val="both"/>
+              <w:rPr>
+                <w:rFonts w:ascii="Times New Roman" w:hAnsi="Times New Roman" w:cs="Times New Roman"/>
+                <w:bCs/>
+                <w:i/>
+                <w:color w:val="auto"/>
+                <w:lang w:val="en-US"/>
+              </w:rPr>
+            </w:pPr>
+            <w:r>
+              <w:rPr>
+                <w:rFonts w:ascii="Times New Roman" w:hAnsi="Times New Roman" w:cs="Times New Roman"/>
+                <w:bCs/>
+                <w:i/>
+                <w:color w:val="auto"/>
+                <w:lang w:val="en-US"/>
+              </w:rPr>
+              <w:t>1.</w:t>
+            </w:r>
+            <w:r>
+              <w:rPr>
+                <w:rFonts w:ascii="Times New Roman" w:hAnsi="Times New Roman" w:cs="Times New Roman"/>
+                <w:b/>
+                <w:i/>
+                <w:color w:val="auto"/>
+                <w:lang w:val="en-US"/>
+              </w:rPr>
+              <w:t xml:space="preserve"> </w:t>
+            </w:r>
+            <w:r>
+              <w:rPr>
+                <w:rFonts w:ascii="Times New Roman" w:hAnsi="Times New Roman" w:cs="Times New Roman"/>
+                <w:bCs/>
+                <w:i/>
+                <w:color w:val="auto"/>
+                <w:lang w:val="en-US"/>
+              </w:rPr>
+              <w:t>Thân nhân liệt sĩ tự nguyện cung cấp mẫu ADN và cung cấp thông tin sinh trắc học ADN vào Cơ sở dữ liệu Căn cước thì ký và ghi rõ họ tên vào cột số (11) ở bảng trên</w:t>
+            </w:r>
+            <w:r>
+              <w:rPr>
+                <w:rFonts w:ascii="Times New Roman" w:hAnsi="Times New Roman" w:cs="Times New Roman"/>
+                <w:bCs/>
+                <w:i/>
+                <w:color w:val="auto"/>
+                <w:lang w:val="en-US"/>
+              </w:rPr>
+              <w:t>.</w:t>
+            </w:r>
+          </w:p>
+        </w:tc>
+      </w:tr>
+      <w:tr>
+        <w:tc>
+          <w:tcPr>
+            <w:tcW w:w="861" w:type="dxa"/>
+          </w:tcPr>
+          <w:p>
+            <w:pPr>
+              <w:rPr>
+                <w:rFonts w:ascii="Times New Roman" w:hAnsi="Times New Roman" w:cs="Times New Roman"/>
+                <w:lang w:val="en-US"/>
+              </w:rPr>
+            </w:pPr>
+          </w:p>
+        </w:tc>
+        <w:tc>
+          <w:tcPr>
+            <w:tcW w:w="12378" w:type="dxa"/>
+          </w:tcPr>
+          <w:p>
+            <w:pPr>
+              <w:ind w:left="-113" w:firstLine="24"/>
+              <w:jc w:val="both"/>
+              <w:rPr>
+                <w:rFonts w:ascii="Times New Roman" w:hAnsi="Times New Roman" w:cs="Times New Roman"/>
+                <w:bCs/>
+                <w:i/>
+                <w:color w:val="auto"/>
+                <w:lang w:val="en-US"/>
+              </w:rPr>
+            </w:pPr>
+            <w:r>
+              <w:rPr>
+                <w:rFonts w:ascii="Times New Roman" w:hAnsi="Times New Roman" w:cs="Times New Roman"/>
+                <w:bCs/>
+                <w:i/>
+                <w:color w:val="auto"/>
+                <w:lang w:val="en-US"/>
+              </w:rPr>
+              <w:t xml:space="preserve">2. Thu </w:t>
+            </w:r>
+            <w:r>
+              <w:rPr>
+                <w:rFonts w:ascii="Times New Roman" w:hAnsi="Times New Roman" w:cs="Times New Roman"/>
+                <w:bCs/>
+                <w:i/>
+                <w:color w:val="auto"/>
+                <w:lang w:val="en-US"/>
+              </w:rPr>
+              <w:t>0</w:t>
+            </w:r>
+            <w:r>
+              <w:rPr>
+                <w:rFonts w:ascii="Times New Roman" w:hAnsi="Times New Roman" w:cs="Times New Roman"/>
+                <w:bCs/>
+                <w:i/>
+                <w:color w:val="auto"/>
+                <w:lang w:val="en-US"/>
+              </w:rPr>
+              <w:t>1</w:t>
+            </w:r>
+            <w:r>
+              <w:rPr>
+                <w:rFonts w:ascii="Times New Roman" w:hAnsi="Times New Roman" w:cs="Times New Roman"/>
+                <w:bCs/>
+                <w:i/>
+                <w:color w:val="auto"/>
+                <w:lang w:val="en-US"/>
+              </w:rPr>
+              <w:t xml:space="preserve"> mẫu </w:t>
+            </w:r>
+            <w:r>
+              <w:rPr>
+                <w:rFonts w:ascii="Times New Roman" w:hAnsi="Times New Roman" w:cs="Times New Roman"/>
+                <w:bCs/>
+                <w:i/>
+                <w:color w:val="auto"/>
+                <w:lang w:val="en-US"/>
+              </w:rPr>
+              <w:t>ADN/ 01</w:t>
+            </w:r>
+            <w:r>
+              <w:rPr>
+                <w:rFonts w:ascii="Times New Roman" w:hAnsi="Times New Roman" w:cs="Times New Roman"/>
+                <w:bCs/>
+                <w:i/>
+                <w:color w:val="auto"/>
+                <w:lang w:val="en-US"/>
+              </w:rPr>
+              <w:t xml:space="preserve"> </w:t>
+            </w:r>
+            <w:r>
+              <w:rPr>
+                <w:rFonts w:ascii="Times New Roman" w:hAnsi="Times New Roman" w:cs="Times New Roman"/>
+                <w:bCs/>
+                <w:i/>
+                <w:color w:val="auto"/>
+                <w:lang w:val="en-US"/>
+              </w:rPr>
+              <w:t>người thân có mối quan hệ huyết thống theo dòng mẹ của liệt sĩ để xét nghiệm ADN ti thể với thứ tự ưu tiên</w:t>
+            </w:r>
+            <w:r>
+              <w:rPr>
+                <w:rFonts w:ascii="Times New Roman" w:hAnsi="Times New Roman" w:cs="Times New Roman"/>
+                <w:bCs/>
+                <w:i/>
+                <w:color w:val="auto"/>
+                <w:lang w:val="en-US"/>
+              </w:rPr>
+              <w:t xml:space="preserve"> từ 1 đến 6</w:t>
+            </w:r>
+            <w:r>
+              <w:rPr>
+                <w:rFonts w:ascii="Times New Roman" w:hAnsi="Times New Roman" w:cs="Times New Roman"/>
+                <w:bCs/>
+                <w:i/>
+                <w:color w:val="auto"/>
+                <w:lang w:val="en-US"/>
+              </w:rPr>
+              <w:t>.</w:t>
+            </w:r>
+          </w:p>
+          <w:p>
+            <w:pPr>
+              <w:ind w:left="-113" w:firstLine="24"/>
+              <w:jc w:val="both"/>
+              <w:rPr>
+                <w:rFonts w:ascii="Times New Roman" w:hAnsi="Times New Roman" w:cs="Times New Roman"/>
+                <w:bCs/>
+                <w:i/>
+                <w:color w:val="auto"/>
+                <w:lang w:val="en-US"/>
+              </w:rPr>
+            </w:pPr>
+            <w:r>
+              <w:rPr>
+                <w:rFonts w:ascii="Times New Roman" w:hAnsi="Times New Roman" w:cs="Times New Roman"/>
+                <w:bCs/>
+                <w:i/>
+                <w:color w:val="auto"/>
+                <w:lang w:val="en-US"/>
+              </w:rPr>
+              <w:t>3. Thu mẫu tối thiểu 01 người</w:t>
+            </w:r>
+            <w:r>
+              <w:rPr>
+                <w:rFonts w:ascii="Times New Roman" w:hAnsi="Times New Roman" w:cs="Times New Roman"/>
+                <w:bCs/>
+                <w:i/>
+                <w:color w:val="auto"/>
+                <w:lang w:val="en-US"/>
+              </w:rPr>
+              <w:t xml:space="preserve"> còn sống</w:t>
+            </w:r>
+            <w:r>
+              <w:rPr>
+                <w:rFonts w:ascii="Times New Roman" w:hAnsi="Times New Roman" w:cs="Times New Roman"/>
+                <w:bCs/>
+                <w:i/>
+                <w:color w:val="auto"/>
+                <w:lang w:val="en-US"/>
+              </w:rPr>
+              <w:t>, trường hợp có nhiều hơn thì lựa chọn 02 người</w:t>
+            </w:r>
+            <w:r>
+              <w:rPr>
+                <w:rFonts w:ascii="Times New Roman" w:hAnsi="Times New Roman" w:cs="Times New Roman"/>
+                <w:bCs/>
+                <w:i/>
+                <w:color w:val="auto"/>
+                <w:lang w:val="en-US"/>
+              </w:rPr>
+              <w:t xml:space="preserve"> còn sống</w:t>
+            </w:r>
+            <w:r>
+              <w:rPr>
+                <w:rFonts w:ascii="Times New Roman" w:hAnsi="Times New Roman" w:cs="Times New Roman"/>
+                <w:bCs/>
+                <w:i/>
+                <w:color w:val="auto"/>
+                <w:lang w:val="en-US"/>
+              </w:rPr>
+              <w:t xml:space="preserve"> theo thứ tự ưu tiên từ 1 đến 6 (có thể thu 02 người cùng mức ưu tiên).</w:t>
+            </w:r>
+          </w:p>
+        </w:tc>
+      </w:tr>
+      <w:tr>
+        <w:tc>
+          <w:tcPr>
+            <w:tcW w:w="861" w:type="dxa"/>
+          </w:tcPr>
+          <w:p>
+            <w:pPr>
+              <w:rPr>
+                <w:rFonts w:ascii="Times New Roman" w:hAnsi="Times New Roman" w:cs="Times New Roman"/>
+                <w:lang w:val="en-US"/>
+              </w:rPr>
+            </w:pPr>
+          </w:p>
+        </w:tc>
+        <w:tc>
+          <w:tcPr>
+            <w:tcW w:w="12378" w:type="dxa"/>
+          </w:tcPr>
+          <w:p>
+            <w:pPr>
+              <w:ind w:left="-113"/>
+              <w:jc w:val="both"/>
+              <w:rPr>
+                <w:rFonts w:ascii="Times New Roman" w:hAnsi="Times New Roman" w:cs="Times New Roman"/>
+                <w:bCs/>
+                <w:i/>
+                <w:color w:val="auto"/>
+                <w:lang w:val="en-US"/>
+              </w:rPr>
+            </w:pPr>
+            <w:r>
+              <w:rPr>
+                <w:rFonts w:ascii="Times New Roman" w:hAnsi="Times New Roman" w:cs="Times New Roman"/>
+                <w:bCs/>
+                <w:i/>
+                <w:color w:val="auto"/>
+                <w:lang w:val="en-US"/>
+              </w:rPr>
+              <w:t>4</w:t>
+            </w:r>
+            <w:r>
+              <w:rPr>
+                <w:rFonts w:ascii="Times New Roman" w:hAnsi="Times New Roman" w:cs="Times New Roman"/>
+                <w:bCs/>
+                <w:i/>
+                <w:color w:val="auto"/>
+                <w:lang w:val="en-US"/>
+              </w:rPr>
+              <w:t xml:space="preserve">. </w:t>
+            </w:r>
+            <w:r>
+              <w:rPr>
+                <w:rFonts w:ascii="Times New Roman" w:hAnsi="Times New Roman" w:cs="Times New Roman"/>
+                <w:bCs/>
+                <w:i/>
+                <w:color w:val="auto"/>
+                <w:lang w:val="en-US"/>
+              </w:rPr>
+              <w:t>Đối với cột số (2) ưu tiên thu thập</w:t>
+            </w:r>
+            <w:r>
+              <w:rPr>
+                <w:rFonts w:ascii="Times New Roman" w:hAnsi="Times New Roman" w:cs="Times New Roman"/>
+                <w:bCs/>
+                <w:i/>
+                <w:color w:val="auto"/>
+                <w:lang w:val="en-US"/>
+              </w:rPr>
+              <w:t xml:space="preserve"> </w:t>
+            </w:r>
+            <w:r>
+              <w:rPr>
+                <w:rFonts w:ascii="Times New Roman" w:hAnsi="Times New Roman" w:cs="Times New Roman"/>
+                <w:bCs/>
+                <w:i/>
+                <w:color w:val="auto"/>
+                <w:lang w:val="en-US"/>
+              </w:rPr>
+              <w:t>thông tin sinh trắc học ADN của thân nhân còn sống</w:t>
+            </w:r>
+            <w:r>
+              <w:rPr>
+                <w:rFonts w:ascii="Times New Roman" w:hAnsi="Times New Roman" w:cs="Times New Roman"/>
+                <w:bCs/>
+                <w:i/>
+                <w:color w:val="auto"/>
+                <w:lang w:val="en-US"/>
+              </w:rPr>
+              <w:t>; cột (3;4;5;6) ghi tối đa 02 người còn sống.</w:t>
+            </w:r>
+          </w:p>
+        </w:tc>
+      </w:tr>
+    </w:tbl>
+    <w:p>
+      <w:pPr>
+        <w:ind w:firstLine="567"/>
+        <w:rPr>
+          <w:rFonts w:ascii="Times New Roman" w:hAnsi="Times New Roman" w:cs="Times New Roman"/>
           <w:bCs/>
           <w:i/>
           <w:color w:val="auto"/>
@@ -2391,8 +2359,8 @@
       </w:pPr>
     </w:p>
     <w:sectPr>
-      <w:pgSz w:w="15840" w:h="12240" w:orient="landscape"/>
-      <w:pgMar w:top="1440" w:right="1440" w:bottom="1440" w:left="1440" w:header="708" w:footer="708" w:gutter="0"/>
+      <w:pgSz w:w="16838" w:h="11906" w:orient="landscape" w:code="9"/>
+      <w:pgMar w:top="851" w:right="1440" w:bottom="1440" w:left="1440" w:header="708" w:footer="708" w:gutter="0"/>
       <w:cols w:space="708"/>
       <w:docGrid w:linePitch="360"/>
     </w:sectPr>
@@ -2559,6 +2527,7 @@
     <w:lsdException w:name="HTML Sample" w:semiHidden="1" w:unhideWhenUsed="1"/>
     <w:lsdException w:name="HTML Typewriter" w:semiHidden="1" w:unhideWhenUsed="1"/>
     <w:lsdException w:name="HTML Variable" w:semiHidden="1" w:unhideWhenUsed="1"/>
+    <w:lsdException w:name="Normal Table" w:semiHidden="1" w:unhideWhenUsed="1"/>
     <w:lsdException w:name="annotation subject" w:semiHidden="1" w:unhideWhenUsed="1"/>
     <w:lsdException w:name="No List" w:semiHidden="1" w:unhideWhenUsed="1"/>
     <w:lsdException w:name="Outline List 1" w:semiHidden="1" w:unhideWhenUsed="1"/>
@@ -2601,8 +2570,11 @@
     <w:lsdException w:name="Table Contemporary" w:semiHidden="1" w:unhideWhenUsed="1"/>
     <w:lsdException w:name="Table Elegant" w:semiHidden="1" w:unhideWhenUsed="1"/>
     <w:lsdException w:name="Table Professional" w:semiHidden="1" w:unhideWhenUsed="1"/>
+    <w:lsdException w:name="Table Subtle 1" w:semiHidden="1" w:unhideWhenUsed="1"/>
     <w:lsdException w:name="Table Subtle 2" w:semiHidden="1" w:unhideWhenUsed="1"/>
     <w:lsdException w:name="Table Web 1" w:semiHidden="1" w:unhideWhenUsed="1"/>
+    <w:lsdException w:name="Table Web 2" w:semiHidden="1" w:unhideWhenUsed="1"/>
+    <w:lsdException w:name="Table Web 3" w:semiHidden="1" w:unhideWhenUsed="1"/>
     <w:lsdException w:name="Balloon Text" w:semiHidden="1" w:unhideWhenUsed="1"/>
     <w:lsdException w:name="Table Grid" w:uiPriority="0"/>
     <w:lsdException w:name="Table Theme" w:semiHidden="1" w:unhideWhenUsed="1"/>
@@ -3894,7 +3866,7 @@
 </file>
 
 <file path=customXml/itemProps1.xml><?xml version="1.0" encoding="utf-8"?>
-<ds:datastoreItem xmlns:ds="http://schemas.openxmlformats.org/officeDocument/2006/customXml" ds:itemID="{8E5F1FE1-F951-4BF2-A2DF-D0B201D6A755}">
+<ds:datastoreItem xmlns:ds="http://schemas.openxmlformats.org/officeDocument/2006/customXml" ds:itemID="{8B294DA8-5431-4BAB-B45F-898A324F1FB3}">
   <ds:schemaRefs>
     <ds:schemaRef ds:uri="http://schemas.openxmlformats.org/officeDocument/2006/bibliography"/>
   </ds:schemaRefs>

</xml_diff>